<commit_message>
court(ncctapp): second pass on the shared model: gate opening-brief, petition-for-review, amicus-brief (latex reported), answering-brief (docx reported); reply-brief keeps the conclusion with the closing, stays reported (fb-595.54.50)
Co-Authored-By: Claude Opus 5.5 <noreply@anthropic.com>
</commit_message>
<xml_diff>
--- a/courts/fourth-circuit/north-carolina/state/court-of-appeals/amicus-brief/usage/OUTPUT-amicus-brief.docx
+++ b/courts/fourth-circuit/north-carolina/state/court-of-appeals/amicus-brief/usage/OUTPUT-amicus-brief.docx
@@ -5888,13 +5888,7 @@
         <w:noBreakHyphen/>
       </w:r>
       <w:r>
-        <w:t xml:space="preserve">2), https://​www.​ncappellatecourts.​org/​show-​file.​php?document_id=93936 [hereinafter James Appellants’ Br.]. Moreover, election workers were required to provide each provisional voter with a “written information” explaining how they could later ascertain “whether and to what extent the ballot was counted” or “not counted.” Id. at App. 3 (quoting N.C. Gen. Stat. § 163</w:t>
-      </w:r>
-      <w:r>
-        <w:noBreakHyphen/>
-      </w:r>
-      <w:r>
-        <w:t xml:space="preserve">166.11(3) (2004)).</w:t>
+        <w:t xml:space="preserve">2), https://​www.​ncappellatecourts.​org/​show-​file.​php?​document_id=93936 [hereinafter James Appellants’ Br.]. Moreover, election workers were required to provide each provisional voter with a “written information” explaining how they could later ascertain “whether and to what extent the ballot was counted” or “not counted.” Id. at App. 3 (quoting N.C. Gen. Stat. § 163-⁠166.11(3) (2004)).</w:t>
       </w:r>
     </w:p>
     <w:p>
@@ -9821,6 +9815,33 @@
       <w:ind w:left="2160" w:hanging="720"/>
     </w:pPr>
   </w:style>
+  <w:style w:type="paragraph" w:customStyle="1" w:styleId="XdQuoteList1">
+    <w:name w:val="Xd Quote List 1"/>
+    <w:basedOn w:val="Normal"/>
+    <w:qFormat/>
+    <w:pPr>
+      <w:spacing w:before="0" w:after="0" w:line="276" w:lineRule="exact"/>
+      <w:ind w:left="1440" w:right="720" w:hanging="720"/>
+    </w:pPr>
+  </w:style>
+  <w:style w:type="paragraph" w:customStyle="1" w:styleId="XdQuoteList2">
+    <w:name w:val="Xd Quote List 2"/>
+    <w:basedOn w:val="Normal"/>
+    <w:qFormat/>
+    <w:pPr>
+      <w:spacing w:before="0" w:after="0" w:line="276" w:lineRule="exact"/>
+      <w:ind w:left="2160" w:right="720" w:hanging="720"/>
+    </w:pPr>
+  </w:style>
+  <w:style w:type="paragraph" w:customStyle="1" w:styleId="XdQuoteList3">
+    <w:name w:val="Xd Quote List 3"/>
+    <w:basedOn w:val="Normal"/>
+    <w:qFormat/>
+    <w:pPr>
+      <w:spacing w:before="0" w:after="0" w:line="276" w:lineRule="exact"/>
+      <w:ind w:left="2880" w:right="720" w:hanging="720"/>
+    </w:pPr>
+  </w:style>
   <w:style w:type="paragraph" w:customStyle="1" w:styleId="SourceCode">
     <w:name w:val="Source Code"/>
     <w:basedOn w:val="Normal"/>

</xml_diff>